<commit_message>
feat(ah): Selbstzahler-Angebot mit Netto, 7 % MwSt. und Brutto
Selbstzahler sehen im AH-Angebot Nettobetrag, zzgl. 7 % MwSt. und
Gesamtbetrag brutto (Sätze sind netto, laut Buchhaltung). Kassenkunde
unverändert. Neues Preview-Fixture ah-selbstzahler-mwst.

Co-Authored-By: Claude Opus 5.5 <noreply@anthropic.com>
</commit_message>
<xml_diff>
--- a/src/templates/AH-Angebot.docx
+++ b/src/templates/AH-Angebot.docx
@@ -1479,7 +1479,7 @@
                 <w:szCs w:val="18"/>
                 <w:lang w:val="de-DE" w:eastAsia="ru-RU"/>
               </w:rPr>
-              <w:t>Gesamtbetrag</w:t>
+              <w:t>{AhGesamtLabel}</w:t>
             </w:r>
           </w:p>
         </w:tc>
@@ -1510,6 +1510,204 @@
                 <w:lang w:val="de-DE" w:eastAsia="ru-RU"/>
               </w:rPr>
               <w:t>{AhGesamtbetrag}</w:t>
+            </w:r>
+          </w:p>
+        </w:tc>
+      </w:tr>
+      <w:tr>
+        <w:trPr>
+          <w:trHeight w:val="344" w:hRule="atLeast"/>
+        </w:trPr>
+        <w:tc>
+          <w:tcPr>
+            <w:tcW w:w="6659" w:type="dxa"/>
+            <w:gridSpan w:val="3"/>
+            <w:tcBorders/>
+            <w:shd w:fill="FFFFFF" w:val="clear"/>
+            <w:vAlign w:val="center"/>
+          </w:tcPr>
+          <w:p>
+            <w:pPr>
+              <w:pStyle w:val="Normal"/>
+              <w:suppressAutoHyphens w:val="true"/>
+              <w:spacing w:before="0" w:after="0"/>
+              <w:jc w:val="right"/>
+              <w:rPr>
+                <w:b w:val="false"/>
+                <w:bCs w:val="false"/>
+              </w:rPr>
+            </w:pPr>
+            <w:r>
+              <w:rPr>
+                <w:rFonts w:eastAsia="Open Sans" w:cs="Open Sans" w:ascii="Open Sans" w:hAnsi="Open Sans"/>
+                <w:b w:val="false"/>
+                <w:bCs w:val="false"/>
+                <w:i w:val="false"/>
+                <w:caps w:val="false"/>
+                <w:smallCaps w:val="false"/>
+                <w:color w:val="000000"/>
+                <w:spacing w:val="0"/>
+                <w:sz w:val="18"/>
+                <w:szCs w:val="18"/>
+                <w:lang w:val="de-DE" w:eastAsia="ru-RU"/>
+              </w:rPr>
+              <w:t>{#AhIsSZ}</w:t>
+            </w:r>
+            <w:r>
+              <w:rPr>
+                <w:rFonts w:ascii="Open Sans" w:hAnsi="Open Sans"/>
+                <w:b w:val="false"/>
+                <w:bCs w:val="false"/>
+                <w:i w:val="false"/>
+                <w:caps w:val="false"/>
+                <w:smallCaps w:val="false"/>
+                <w:color w:val="000000"/>
+                <w:spacing w:val="0"/>
+                <w:sz w:val="18"/>
+                <w:szCs w:val="18"/>
+              </w:rPr>
+              <w:t>{AhMwstLabel}</w:t>
+            </w:r>
+          </w:p>
+        </w:tc>
+        <w:tc>
+          <w:tcPr>
+            <w:tcW w:w="2975" w:type="dxa"/>
+            <w:gridSpan w:val="2"/>
+            <w:tcBorders/>
+            <w:shd w:fill="FFFFFF" w:val="clear"/>
+            <w:vAlign w:val="center"/>
+          </w:tcPr>
+          <w:p>
+            <w:pPr>
+              <w:pStyle w:val="Normal"/>
+              <w:suppressAutoHyphens w:val="true"/>
+              <w:spacing w:before="0" w:after="0"/>
+              <w:jc w:val="right"/>
+              <w:rPr>
+                <w:b w:val="false"/>
+                <w:bCs w:val="false"/>
+              </w:rPr>
+            </w:pPr>
+            <w:r>
+              <w:rPr>
+                <w:rFonts w:ascii="Open Sans" w:hAnsi="Open Sans"/>
+                <w:b w:val="false"/>
+                <w:bCs w:val="false"/>
+                <w:i w:val="false"/>
+                <w:caps w:val="false"/>
+                <w:smallCaps w:val="false"/>
+                <w:color w:val="000000"/>
+                <w:spacing w:val="0"/>
+                <w:sz w:val="18"/>
+                <w:szCs w:val="18"/>
+              </w:rPr>
+              <w:t/>
+            </w:r>
+            <w:r>
+              <w:rPr>
+                <w:rFonts w:ascii="Open Sans" w:hAnsi="Open Sans"/>
+                <w:b w:val="false"/>
+                <w:bCs w:val="false"/>
+                <w:i w:val="false"/>
+                <w:caps w:val="false"/>
+                <w:smallCaps w:val="false"/>
+                <w:color w:val="000000"/>
+                <w:spacing w:val="0"/>
+                <w:sz w:val="18"/>
+                <w:szCs w:val="18"/>
+              </w:rPr>
+              <w:t>{AhMwst}</w:t>
+            </w:r>
+          </w:p>
+        </w:tc>
+      </w:tr>
+      <w:tr>
+        <w:trPr>
+          <w:trHeight w:val="344" w:hRule="atLeast"/>
+        </w:trPr>
+        <w:tc>
+          <w:tcPr>
+            <w:tcW w:w="6659" w:type="dxa"/>
+            <w:gridSpan w:val="3"/>
+            <w:tcBorders/>
+            <w:shd w:fill="CCCCCC" w:val="clear"/>
+            <w:vAlign w:val="center"/>
+          </w:tcPr>
+          <w:p>
+            <w:pPr>
+              <w:pStyle w:val="Normal"/>
+              <w:suppressAutoHyphens w:val="true"/>
+              <w:spacing w:before="0" w:after="0"/>
+              <w:jc w:val="right"/>
+              <w:rPr>
+                <w:rFonts w:ascii="Open Sans" w:hAnsi="Open Sans"/>
+              </w:rPr>
+            </w:pPr>
+            <w:r>
+              <w:rPr>
+                <w:rFonts w:eastAsia="Open Sans" w:cs="Open Sans" w:ascii="Open Sans" w:hAnsi="Open Sans"/>
+                <w:b/>
+                <w:bCs/>
+                <w:i w:val="false"/>
+                <w:caps w:val="false"/>
+                <w:smallCaps w:val="false"/>
+                <w:color w:val="000000"/>
+                <w:spacing w:val="0"/>
+                <w:sz w:val="18"/>
+                <w:szCs w:val="18"/>
+                <w:lang w:val="de-DE" w:eastAsia="ru-RU"/>
+              </w:rPr>
+              <w:t>Gesamtbetrag brutto</w:t>
+            </w:r>
+          </w:p>
+        </w:tc>
+        <w:tc>
+          <w:tcPr>
+            <w:tcW w:w="2975" w:type="dxa"/>
+            <w:gridSpan w:val="2"/>
+            <w:tcBorders/>
+            <w:shd w:fill="CCCCCC" w:val="clear"/>
+            <w:vAlign w:val="center"/>
+          </w:tcPr>
+          <w:p>
+            <w:pPr>
+              <w:pStyle w:val="Normal"/>
+              <w:suppressAutoHyphens w:val="true"/>
+              <w:spacing w:before="0" w:after="0"/>
+              <w:jc w:val="right"/>
+              <w:rPr>
+                <w:rFonts w:ascii="Open Sans" w:hAnsi="Open Sans"/>
+              </w:rPr>
+            </w:pPr>
+            <w:r>
+              <w:rPr>
+                <w:rFonts w:eastAsia="Arial" w:cs="Arial" w:ascii="Open Sans" w:hAnsi="Open Sans"/>
+                <w:b/>
+                <w:bCs/>
+                <w:kern w:val="0"/>
+                <w:sz w:val="18"/>
+                <w:szCs w:val="18"/>
+                <w:lang w:val="pl-PL" w:eastAsia="en-US" w:bidi="ar-SA"/>
+              </w:rPr>
+              <w:t>{AhBrutto}</w:t>
+            </w:r>
+            <w:r>
+              <w:rPr>
+                <w:rFonts w:eastAsia="Open Sans" w:cs="Open Sans" w:ascii="Open Sans" w:hAnsi="Open Sans"/>
+                <w:b/>
+                <w:bCs/>
+                <w:i w:val="false"/>
+                <w:caps w:val="false"/>
+                <w:smallCaps w:val="false"/>
+                <w:color w:val="000000"/>
+                <w:spacing w:val="0"/>
+                <w:kern w:val="0"/>
+                <w:sz w:val="18"/>
+                <w:szCs w:val="18"/>
+                <w:lang w:val="pl-PL" w:eastAsia="en-US" w:bidi="ar-SA"/>
+              </w:rPr>
+              <w:t>{/AhIsSZ}</w:t>
             </w:r>
           </w:p>
         </w:tc>

</xml_diff>